<commit_message>
Vol 3: rebrand title page from Science for Everyone to Physics, Actually
Matches the cover, which already used the PHYSICS, ACTUALLY branding;
the title page had not been updated to match.

Co-Authored-By: Claude Sonnet 5 <noreply@anthropic.com>
</commit_message>
<xml_diff>
--- a/Science Books/Physics/Volume 3/Physics Vol 3 - The Standard Model, Chaos, and the Edge of Knowledge.docx
+++ b/Science Books/Physics/Volume 3/Physics Vol 3 - The Standard Model, Chaos, and the Edge of Knowledge.docx
@@ -16,7 +16,7 @@
           <w:sz w:val="56"/>
           <w:szCs w:val="56"/>
         </w:rPr>
-        <w:t xml:space="preserve">Science for Everyone</w:t>
+        <w:t xml:space="preserve">PHYSICS, ACTUALLY</w:t>
       </w:r>
     </w:p>
     <w:p>
@@ -33,7 +33,7 @@
           <w:sz w:val="36"/>
           <w:szCs w:val="36"/>
         </w:rPr>
-        <w:t xml:space="preserve">PHYSICS VOL. 3</w:t>
+        <w:t xml:space="preserve">VOLUME 3</w:t>
       </w:r>
     </w:p>
     <w:p>
@@ -4373,7 +4373,7 @@
           <w:sz w:val="22"/>
           <w:szCs w:val="22"/>
         </w:rPr>
-        <w:t xml:space="preserve">All because electrons live in quantum energy bands. That is a spectacular amount of civilization to build on something that, at first glance, looks like a rather boring grey crystal. Silicon, it turns out, was never boring. We simply hadn't learned how to ask it the right question.</w:t>
+        <w:t xml:space="preserve">All because electrons live in quantum energy bands. That is a spectacular amount of civilization to build on something that, at first glance, looks like a rather boring gray crystal. Silicon, it turns out, was never boring. We simply hadn't learned how to ask it the right question.</w:t>
       </w:r>
     </w:p>
     <w:p>
@@ -6494,7 +6494,7 @@
           <w:sz w:val="22"/>
           <w:szCs w:val="22"/>
         </w:rPr>
-        <w:t xml:space="preserve">This is the cosmological constant problem — sometimes called the worst quantitative prediction in the history of physics. Something must be cancelling almost all of that vacuum energy. Nobody has a confirmed explanation for why the cancellation is not complete, or why what remains has the tiny value it does.</w:t>
+        <w:t xml:space="preserve">This is the cosmological constant problem — sometimes called the worst quantitative prediction in the history of physics. Something must be canceling almost all of that vacuum energy. Nobody has a confirmed explanation for why the cancellation is not complete, or why what remains has the tiny value it does.</w:t>
       </w:r>
     </w:p>
     <w:p>

</xml_diff>

<commit_message>
House style: switch to American English
Per direction, the series has switched from British to American
English. Volume 3 was already converted; documenting the standard
here and noting that Volumes 1, 2, and 4 still need converting
(follow-up commits handle that).
</commit_message>
<xml_diff>
--- a/Science Books/Physics/Volume 3/Physics Vol 3 - The Standard Model, Chaos, and the Edge of Knowledge.docx
+++ b/Science Books/Physics/Volume 3/Physics Vol 3 - The Standard Model, Chaos, and the Edge of Knowledge.docx
@@ -1,6 +1,6 @@
 
 <file path=word/document.xml><?xml version="1.0" encoding="utf-8"?>
-<w:document xmlns:mc="http://schemas.openxmlformats.org/markup-compatibility/2006" xmlns:r="http://schemas.openxmlformats.org/officeDocument/2006/relationships" xmlns:w="http://schemas.openxmlformats.org/wordprocessingml/2006/main" mc:Ignorable="w14 w15 wp14">
+<w:document xmlns:wpc="http://schemas.microsoft.com/office/word/2010/wordprocessingCanvas" xmlns:mc="http://schemas.openxmlformats.org/markup-compatibility/2006" xmlns:o="urn:schemas-microsoft-com:office:office" xmlns:r="http://schemas.openxmlformats.org/officeDocument/2006/relationships" xmlns:m="http://schemas.openxmlformats.org/officeDocument/2006/math" xmlns:v="urn:schemas-microsoft-com:vml" xmlns:wp14="http://schemas.microsoft.com/office/word/2010/wordprocessingDrawing" xmlns:wp="http://schemas.openxmlformats.org/drawingml/2006/wordprocessingDrawing" xmlns:w10="urn:schemas-microsoft-com:office:word" xmlns:w="http://schemas.openxmlformats.org/wordprocessingml/2006/main" xmlns:w14="http://schemas.microsoft.com/office/word/2010/wordml" xmlns:w15="http://schemas.microsoft.com/office/word/2012/wordml" xmlns:wpg="http://schemas.microsoft.com/office/word/2010/wordprocessingGroup" xmlns:wpi="http://schemas.microsoft.com/office/word/2010/wordprocessingInk" xmlns:wne="http://schemas.microsoft.com/office/word/2006/wordml" xmlns:wps="http://schemas.microsoft.com/office/word/2010/wordprocessingShape" xmlns:cx="http://schemas.microsoft.com/office/drawing/2014/chartex" xmlns:cx1="http://schemas.microsoft.com/office/drawing/2015/9/8/chartex" xmlns:cx2="http://schemas.microsoft.com/office/drawing/2015/10/21/chartex" xmlns:cx3="http://schemas.microsoft.com/office/drawing/2016/5/9/chartex" xmlns:cx4="http://schemas.microsoft.com/office/drawing/2016/5/10/chartex" xmlns:cx5="http://schemas.microsoft.com/office/drawing/2016/5/11/chartex" xmlns:cx6="http://schemas.microsoft.com/office/drawing/2016/5/12/chartex" xmlns:cx7="http://schemas.microsoft.com/office/drawing/2016/5/13/chartex" xmlns:cx8="http://schemas.microsoft.com/office/drawing/2016/5/14/chartex" xmlns:aink="http://schemas.microsoft.com/office/drawing/2016/ink" xmlns:am3d="http://schemas.microsoft.com/office/drawing/2017/model3d" xmlns:w16cex="http://schemas.microsoft.com/office/word/2018/wordml/cex" xmlns:w16cid="http://schemas.microsoft.com/office/word/2016/wordml/cid" xmlns:w16="http://schemas.microsoft.com/office/word/2018/wordml" xmlns:w16sdtdh="http://schemas.microsoft.com/office/word/2020/wordml/sdtdatahash" xmlns:w16se="http://schemas.microsoft.com/office/word/2015/wordml/symex" mc:Ignorable="w14 w15 wp14">
   <w:body>
     <w:p>
       <w:pPr>
@@ -17,23 +17,6 @@
           <w:szCs w:val="56"/>
         </w:rPr>
         <w:t>PHYSICS, ACTUALLY</w:t>
-      </w:r>
-    </w:p>
-    <w:p>
-      <w:pPr>
-        <w:spacing w:after="200"/>
-        <w:jc w:val="center"/>
-      </w:pPr>
-      <w:r>
-        <w:rPr>
-          <w:rFonts w:ascii="Amazon Ember" w:cs="Amazon Ember" w:eastAsia="Amazon Ember" w:hAnsi="Amazon Ember"/>
-          <w:b/>
-          <w:bCs/>
-          <w:color w:val="0000FF"/>
-          <w:sz w:val="22"/>
-          <w:szCs w:val="22"/>
-        </w:rPr>
-        <w:t>Science for Everyone</w:t>
       </w:r>
     </w:p>
     <w:p>

</xml_diff>

<commit_message>
Save the in-progress drafts across the open books, including files that were still only on this machine.
Co-authored-by: Cursor <cursoragent@cursor.com>
</commit_message>
<xml_diff>
--- a/Science Books/Physics/Volume 3/Physics Vol 3 - The Standard Model, Chaos, and the Edge of Knowledge.docx
+++ b/Science Books/Physics/Volume 3/Physics Vol 3 - The Standard Model, Chaos, and the Edge of Knowledge.docx
@@ -16,7 +16,7 @@
           <w:sz w:val="56"/>
           <w:szCs w:val="56"/>
         </w:rPr>
-        <w:t>PHYSICS, ACTUALLY</w:t>
+        <w:t xml:space="preserve">Science for Everyone</w:t>
       </w:r>
     </w:p>
     <w:p>
@@ -33,7 +33,7 @@
           <w:sz w:val="36"/>
           <w:szCs w:val="36"/>
         </w:rPr>
-        <w:t>VOLUME 3</w:t>
+        <w:t xml:space="preserve">PHYSICS VOL. 3</w:t>
       </w:r>
     </w:p>
     <w:p>
@@ -481,7 +481,7 @@
           <w:sz w:val="22"/>
           <w:szCs w:val="22"/>
         </w:rPr>
-        <w:t>Physics does not usually get to feel smug. But it has earned the right, at least once. Quantum electrodynamics predicts the magnetic moment of the electron — a measure of how strongly the electron acts like a tiny magnet — to somewhere around twelve decimal places, and experiment agrees. Few human endeavors have ever matched a prediction to a measurement this closely.</w:t>
+        <w:t xml:space="preserve">Physics does not usually get to feel smug. But it has earned the right, at least once. Quantum electrodynamics predicts the magnetic moment of the electron to somewhere around twelve decimal places, and experiment agrees. Few human endeavors have ever matched a prediction to a measurement this closely.</w:t>
       </w:r>
     </w:p>
     <w:p>
@@ -987,7 +987,7 @@
           <w:sz w:val="22"/>
           <w:szCs w:val="22"/>
         </w:rPr>
-        <w:t>Here m is mass, and c is the speed of light — about 300,000 kilometers per second. Because c² is enormous, a minuscule change in mass corresponds to a huge amount of energy. Run the actual arithmetic on one gram: multiply by c² — about 9×10¹⁶ in SI units — and that single gram, fully converted, is worth roughly 9×10¹³ joules. That is in the range of a small nuclear weapon, released from a scrap of mass you could balance on a coin.</w:t>
+        <w:t xml:space="preserve">Because c² is enormous, a minuscule change in mass corresponds to a huge amount of energy. Run the actual arithmetic on one gram: multiply by c² — about 9×10¹⁶ in SI units — and that single gram, fully converted, is worth roughly 9×10¹³ joules. That is in the range of a small nuclear weapon, released from a scrap of mass you could balance on a coin.</w:t>
       </w:r>
     </w:p>
     <w:p>
@@ -1071,19 +1071,19 @@
           <w:sz w:val="22"/>
           <w:szCs w:val="22"/>
         </w:rPr>
-        <w:t>A heavy nucleus can sometimes split into smaller nuclei. Fission. It usually starts when a stray neutron strikes a heavy nucleus like uranium-235, which wobbles, deforms, and tears itself apart. The fragments are more tightly bound per particle than the original nucleus was — the same binding-energy accounting from two sections ago, run in reverse. Energy is released.</w:t>
-      </w:r>
-    </w:p>
-    <w:p>
-      <w:pPr>
-        <w:spacing w:after="120"/>
-      </w:pPr>
-      <w:r>
-        <w:rPr>
-          <w:sz w:val="22"/>
-          <w:szCs w:val="22"/>
-        </w:rPr>
-        <w:t>And under the right circumstances, the fission itself emits more neutrons, which can go on to strike more nuclei and trigger further fissions. A chain reaction. Controlled carefully, this becomes a source of nuclear power. Released extremely rapidly and uncontrollably, it becomes something much less civilized.</w:t>
+        <w:t xml:space="preserve">A heavy nucleus can sometimes split into smaller nuclei. Fission. The products can be more tightly bound. Energy is released.</w:t>
+      </w:r>
+    </w:p>
+    <w:p>
+      <w:pPr>
+        <w:spacing w:after="120"/>
+      </w:pPr>
+      <w:r>
+        <w:rPr>
+          <w:sz w:val="22"/>
+          <w:szCs w:val="22"/>
+        </w:rPr>
+        <w:t xml:space="preserve">And under the right circumstances, emitted neutrons can trigger further fissions. A chain reaction. Controlled carefully, this becomes a source of nuclear power. Released extremely rapidly and uncontrollably, it becomes something much less civilized.</w:t>
       </w:r>
     </w:p>
     <w:p>
@@ -1233,7 +1233,7 @@
           <w:sz w:val="22"/>
           <w:szCs w:val="22"/>
         </w:rPr>
-        <w:t>It helps explain how stars shine. And it leads directly toward QCD — the theory of the strong force, explained properly in the next chapter — and the particle world. The nucleus is a tiny object with a very large opinion of itself. Unfortunately, it has the energy budget to justify the attitude.</w:t>
+        <w:t xml:space="preserve">It helps explain how stars shine. And it leads directly toward QCD and the particle world. The nucleus is a tiny object with a very large opinion of itself. Unfortunately, it has the energy budget to justify the attitude.</w:t>
       </w:r>
     </w:p>
     <w:p>
@@ -1337,19 +1337,19 @@
           <w:sz w:val="22"/>
           <w:szCs w:val="22"/>
         </w:rPr>
-        <w:t>A radioactive nucleus decays. Scientists measure what comes out. They add up the energy.</w:t>
-      </w:r>
-    </w:p>
-    <w:p>
-      <w:pPr>
-        <w:spacing w:after="120"/>
-      </w:pPr>
-      <w:r>
-        <w:rPr>
-          <w:sz w:val="22"/>
-          <w:szCs w:val="22"/>
-        </w:rPr>
-        <w:t>The numbers do not balance. That's alarming. At first, this looks like a disaster. Then Wolfgang Pauli proposes an audacious solution: perhaps an unseen particle is carrying away the missing energy.</w:t>
+        <w:t xml:space="preserve">A radioactive nucleus decays. Scientists measure what comes out. They add up the energy. That's alarming.</w:t>
+      </w:r>
+    </w:p>
+    <w:p>
+      <w:pPr>
+        <w:spacing w:after="120"/>
+      </w:pPr>
+      <w:r>
+        <w:rPr>
+          <w:sz w:val="22"/>
+          <w:szCs w:val="22"/>
+        </w:rPr>
+        <w:t xml:space="preserve">The numbers do not balance. At first, this looks like a disaster. Then Wolfgang Pauli proposes an audacious solution: perhaps an unseen particle is carrying away the missing energy.</w:t>
       </w:r>
     </w:p>
     <w:p>
@@ -1403,7 +1403,7 @@
           <w:sz w:val="22"/>
           <w:szCs w:val="22"/>
         </w:rPr>
-        <w:t>The particle eventually becomes the neutrino. Inside the nucleus, a neutron was turning into a proton, spitting out an electron — and, it turned out, this second, almost invisible particle too. Enrico Fermi incorporates it into his theory of beta decay. But there is an immediate problem. How do you detect something that almost never interacts?</w:t>
+        <w:t xml:space="preserve">The particle eventually becomes the neutrino. Enrico Fermi incorporates it into his theory of beta decay. But there is an immediate problem. How do you detect something that almost never interacts?</w:t>
       </w:r>
     </w:p>
     <w:p>
@@ -1909,7 +1909,7 @@
           <w:sz w:val="22"/>
           <w:szCs w:val="22"/>
         </w:rPr>
-        <w:t>Nuclei are made of protons and neutrons. Protons and neutrons are made of quarks and gluons. At the deepest level currently tested by particle physics, the Standard Model describes fields rather than little mechanical pieces. Picture a field as something like the still surface of a pond, spread through every point in space; a particle is a ripple in that surface — a self-contained disturbance that travels and carries energy, not a tiny floating ball.</w:t>
+        <w:t xml:space="preserve">Nuclei are made of protons and neutrons. Protons and neutrons are made of quarks and gluons. At the deepest level currently tested by particle physics, the Standard Model describes fields rather than little mechanical pieces.</w:t>
       </w:r>
     </w:p>
     <w:p>
@@ -2089,7 +2089,7 @@
           <w:sz w:val="22"/>
           <w:szCs w:val="22"/>
         </w:rPr>
-        <w:t>Neutrinos are electrically neutral leptons. They interact through the weak interaction and gravity, but not through electromagnetism or the strong interaction. That makes them extraordinarily difficult to detect. Trillions of neutrinos pass through your body every second.</w:t>
+        <w:t xml:space="preserve">Neutrinos are electrically neutral leptons. They interact through the weak interaction and gravity, but not through electromagnetism or the strong interaction. That makes them extraordinarily difficult to detect. Billions of neutrinos pass through your body every second.</w:t>
       </w:r>
     </w:p>
     <w:p>
@@ -2131,7 +2131,7 @@
           <w:sz w:val="22"/>
           <w:szCs w:val="22"/>
         </w:rPr>
-        <w:t>The original simplest version of the Standard Model treated neutrinos as massless. Experiments later showed that neutrinos can change from one flavor to another as they travel. This phenomenon is called neutrino oscillation. Here's why that requires mass: a neutrino is actually a quantum mix of different mass states, and those states drift in and out of step with each other as they travel, the way two slightly out-of-sync clocks slip in and out of alignment — a drift that is only possible if the masses are different from each other, and different from zero.</w:t>
+        <w:t xml:space="preserve">The original simplest version of the Standard Model treated neutrinos as massless. Experiments later showed that neutrinos can change from one flavor to another as they travel. This phenomenon is called neutrino oscillation. Oscillation requires neutrinos to have different mass states.</w:t>
       </w:r>
     </w:p>
     <w:p>
@@ -2185,7 +2185,7 @@
           <w:sz w:val="22"/>
           <w:szCs w:val="22"/>
         </w:rPr>
-        <w:t>It is so massive that it decays before it can form ordinary hadrons — particles built from quarks, like protons and neutrons. We therefore do not find top-quark atoms or top-quark nuclei. We detect the top through the products of its extremely rapid decay.</w:t>
+        <w:t xml:space="preserve">It is so massive that it decays before it can form ordinary hadrons. We therefore do not find top-quark atoms or top-quark nuclei. We detect the top through the products of its extremely rapid decay.</w:t>
       </w:r>
     </w:p>
     <w:p>
@@ -2269,7 +2269,7 @@
           <w:sz w:val="22"/>
           <w:szCs w:val="22"/>
         </w:rPr>
-        <w:t>The Higgs boson is different. It is the quantum excitation of the Higgs field and is associated with the Higgs mechanism that gives mass to the W and Z bosons and contributes to the masses of elementary fermions — the matter particles: quarks and leptons. Gravity is missing from this list. That omission is not a typo.</w:t>
+        <w:t xml:space="preserve">The Higgs boson is different. It is the quantum excitation of the Higgs field and is associated with the Higgs mechanism that gives mass to the W and Z bosons and contributes to the masses of elementary fermions. Gravity is missing from this list. That omission is not a typo.</w:t>
       </w:r>
     </w:p>
     <w:p>
@@ -2437,19 +2437,19 @@
           <w:sz w:val="22"/>
           <w:szCs w:val="22"/>
         </w:rPr>
-        <w:t>In 2012, experiments at CERN — the European particle-physics laboratory near Geneva, home to the Large Hadron Collider — announced the discovery of a new particle consistent with the Higgs boson. The Higgs field has a nonzero vacuum value throughout space. Elementary particles interact with that field in different ways. Those interactions contribute to their masses.</w:t>
-      </w:r>
-    </w:p>
-    <w:p>
-      <w:pPr>
-        <w:spacing w:after="120"/>
-      </w:pPr>
-      <w:r>
-        <w:rPr>
-          <w:sz w:val="22"/>
-          <w:szCs w:val="22"/>
-        </w:rPr>
-        <w:t>The popular analogy of particles moving through molasses can be useful for a first intuition, but it should not be taken literally. The Higgs field is not a sticky substance. Loosely: because the Higgs field fills space everywhere, particles that interact with it resist changes to their motion — and physics calls that resistance to changing motion mass. The actual mechanism is a consequence of the structure of the electroweak theory.</w:t>
+        <w:t xml:space="preserve">In 2012, experiments at CERN announced the discovery of a new particle consistent with the Higgs boson. The Higgs field has a nonzero vacuum value throughout space. Elementary particles interact with that field in different ways. Those interactions contribute to their masses.</w:t>
+      </w:r>
+    </w:p>
+    <w:p>
+      <w:pPr>
+        <w:spacing w:after="120"/>
+      </w:pPr>
+      <w:r>
+        <w:rPr>
+          <w:sz w:val="22"/>
+          <w:szCs w:val="22"/>
+        </w:rPr>
+        <w:t xml:space="preserve">The popular analogy of particles moving through molasses can be useful for a first intuition, but it should not be taken literally. The Higgs field is not a sticky substance. The actual mechanism is a consequence of the structure of the electroweak theory.</w:t>
       </w:r>
     </w:p>
     <w:p>
@@ -2521,49 +2521,49 @@
           <w:sz w:val="22"/>
           <w:szCs w:val="22"/>
         </w:rPr>
-        <w:t>The Standard Model becomes much less intimidating when organized. MATTER PARTICLES: quarks and leptons. FORCE CARRIERS: photon, gluons, W and Z bosons. HIGGS BOSON: excitation of the Higgs field.</w:t>
-      </w:r>
-    </w:p>
-    <w:p>
-      <w:pPr>
-        <w:spacing w:after="120"/>
-      </w:pPr>
-      <w:r>
-        <w:rPr>
-          <w:sz w:val="22"/>
-          <w:szCs w:val="22"/>
-        </w:rPr>
-        <w:t>QUARKS feel the strong, weak, and electromagnetic interactions according to their properties. CHARGED LEPTONS feel the weak and electromagnetic interactions. NEUTRINOS interact weakly and gravitationally. THE PHOTON interacts electromagnetically.</w:t>
-      </w:r>
-    </w:p>
-    <w:p>
-      <w:pPr>
-        <w:spacing w:after="120"/>
-      </w:pPr>
-      <w:r>
-        <w:rPr>
-          <w:sz w:val="22"/>
-          <w:szCs w:val="22"/>
-        </w:rPr>
-        <w:t>GLUONS interact strongly. THE W AND Z mediate weak interactions. And THE HIGGS belongs to the mechanism that gives mass to several elementary fields.</w:t>
-      </w:r>
-    </w:p>
-    <w:p>
-      <w:pPr>
-        <w:pStyle w:val="Heading2"/>
-        <w:spacing w:after="80" w:before="200"/>
-        <w:jc w:val="center"/>
-      </w:pPr>
-      <w:r>
-        <w:rPr>
-          <w:rFonts w:ascii="Amazon Ember" w:cs="Amazon Ember" w:eastAsia="Amazon Ember" w:hAnsi="Amazon Ember"/>
-          <w:b/>
-          <w:bCs/>
-          <w:color w:val="0000FF"/>
-          <w:sz w:val="36"/>
-          <w:szCs w:val="36"/>
-        </w:rPr>
-        <w:t>How the Forces Are Related</w:t>
+        <w:t xml:space="preserve">The Standard Model becomes much less intimidating when organized. Matter particles: quarks and leptons. Force carriers: photon, gluons, W and Z bosons. Higgs boson: excitation of the Higgs field.</w:t>
+      </w:r>
+    </w:p>
+    <w:p>
+      <w:pPr>
+        <w:spacing w:after="120"/>
+      </w:pPr>
+      <w:r>
+        <w:rPr>
+          <w:sz w:val="22"/>
+          <w:szCs w:val="22"/>
+        </w:rPr>
+        <w:t xml:space="preserve">Quarks feel the strong, weak, and electromagnetic interactions according to their properties. Leptons feel the weak and electromagnetic interactions if electrically charged. Neutrinos interact weakly and gravitationally. The photon interacts electromagnetically.</w:t>
+      </w:r>
+    </w:p>
+    <w:p>
+      <w:pPr>
+        <w:spacing w:after="120"/>
+      </w:pPr>
+      <w:r>
+        <w:rPr>
+          <w:sz w:val="22"/>
+          <w:szCs w:val="22"/>
+        </w:rPr>
+        <w:t xml:space="preserve">Gluons interact strongly. The W and Z mediate weak interactions. And the Higgs belongs to the mechanism that gives mass to several elementary fields.</w:t>
+      </w:r>
+    </w:p>
+    <w:p>
+      <w:pPr>
+        <w:pStyle w:val="Heading2"/>
+        <w:spacing w:after="80" w:before="200"/>
+        <w:jc w:val="center"/>
+      </w:pPr>
+      <w:r>
+        <w:rPr>
+          <w:rFonts w:ascii="Amazon Ember" w:cs="Amazon Ember" w:eastAsia="Amazon Ember" w:hAnsi="Amazon Ember"/>
+          <w:b/>
+          <w:bCs/>
+          <w:color w:val="0000FF"/>
+          <w:sz w:val="36"/>
+          <w:szCs w:val="36"/>
+        </w:rPr>
+        <w:t xml:space="preserve">Why three forces fit together</w:t>
       </w:r>
     </w:p>
     <w:p>
@@ -2587,7 +2587,7 @@
           <w:sz w:val="22"/>
           <w:szCs w:val="22"/>
         </w:rPr>
-        <w:t>At ordinary energies, the electroweak symmetry is broken — more on what “broken” means for a symmetry in the next chapter — and the familiar photon, W, and Z appear as distinct particles. This is one of the great conceptual achievements of twentieth-century physics: two of the three forces, electromagnetism and the weak force, really do merge into one theory at high energy. The strong force stays mathematically separate in the confirmed Standard Model, though built from the same general kind of mathematics. Whether all three fuse at even higher, untested energies remains an open question, not an established fact.</w:t>
+        <w:t xml:space="preserve">At ordinary energies, the electroweak symmetry is broken and the familiar photon, W, and Z appear as distinct particles. This is one of the great conceptual achievements of twentieth-century physics. Three apparently different interactions turn out to be manifestations of a common mathematical structure at high energy.</w:t>
       </w:r>
     </w:p>
     <w:p>
@@ -2869,7 +2869,7 @@
           <w:sz w:val="22"/>
           <w:szCs w:val="22"/>
         </w:rPr>
-        <w:t>And we already know that gravity refuses to fit neatly into the Standard Model. That is one of the great open questions in physics — a puzzle this book circles back to in Part III, when we ask whether gravity might be strings, tangles, or geometry in disguise.</w:t>
+        <w:t xml:space="preserve">And we already know that gravity refuses to fit neatly into the Standard Model. That is one of the great open questions in physics — a puzzle for another book entirely.</w:t>
       </w:r>
     </w:p>
     <w:p>
@@ -3027,7 +3027,7 @@
           <w:sz w:val="22"/>
           <w:szCs w:val="22"/>
         </w:rPr>
-        <w:t>In 1918, Emmy Noether showed that continuous symmetries are connected to conservation laws. The rough idea: if nothing about a system changes when you shift it — in time, in position, in orientation — there is no crack for a quantity to leak out through, so something has to stay exactly constant. Time-translation symmetry gives conservation of energy. Spatial-translation symmetry gives conservation of momentum. Rotational symmetry gives conservation of angular momentum.</w:t>
+        <w:t xml:space="preserve">In 1918, Emmy Noether showed that continuous symmetries are connected to conservation laws. Time-translation symmetry gives conservation of energy. Spatial-translation symmetry gives conservation of momentum. Rotational symmetry gives conservation of angular momentum.</w:t>
       </w:r>
     </w:p>
     <w:p>
@@ -3201,7 +3201,7 @@
           <w:sz w:val="22"/>
           <w:szCs w:val="22"/>
         </w:rPr>
-        <w:t>Chapter 3 already flagged the catch: most of the mass of ordinary matter comes from the strong interaction, not the Higgs field. The Higgs is enormously important. It is simply not the universe's universal weight machine.</w:t>
+        <w:t xml:space="preserve">But the popular slogan that “the Higgs gives everything mass” is too simple. Most of the mass of ordinary matter comes from the energy associated with the strong interaction inside protons and neutrons. The Higgs is enormously important. It is not the universe's universal weight machine.</w:t>
       </w:r>
     </w:p>
     <w:p>
@@ -3231,7 +3231,7 @@
           <w:sz w:val="22"/>
           <w:szCs w:val="22"/>
         </w:rPr>
-        <w:t>Modern particle physics takes symmetry even further, into a kind called gauge symmetry: a freedom to redefine certain internal, unobservable bookkeeping details of the description at every point in space, without changing a single thing you could ever measure. A bit like being free to call sea level “0 meters” or “100 meters” — the label is arbitrary and never changes how tall anything actually is. Gauge symmetries organize the Standard Model. They determine the mathematical structure of electromagnetic, weak and strong interactions. What looks at first like an enormous collection of unrelated particles turns out to have a remarkable architecture.</w:t>
+        <w:t xml:space="preserve">Modern particle physics takes symmetry even further, into a kind called gauge symmetry: a freedom to redefine certain internal, unobservable bookkeeping details of the description at every point in space, without changing a single thing you could ever measure. Gauge symmetries organize the Standard Model. They determine the mathematical structure of electromagnetic, weak and strong interactions. What looks at first like an enormous collection of unrelated particles turns out to have a remarkable architecture.</w:t>
       </w:r>
     </w:p>
     <w:p>
@@ -3563,7 +3563,7 @@
           <w:sz w:val="22"/>
           <w:szCs w:val="22"/>
         </w:rPr>
-        <w:t>The secret begins with quantum mechanics. In an isolated atom, electrons occupy particular energy levels — picture rungs on a ladder. Put enormous numbers of atoms together into a crystal and those rungs blur into wide bands of allowed energy. Some bands are filled.</w:t>
+        <w:t xml:space="preserve">The secret begins with quantum mechanics. In an isolated atom, electrons occupy particular energy levels. Put enormous numbers of atoms together into a crystal and those levels spread into energy bands. Some bands are filled.</w:t>
       </w:r>
     </w:p>
     <w:p>
@@ -3863,7 +3863,7 @@
           <w:sz w:val="22"/>
           <w:szCs w:val="22"/>
         </w:rPr>
-        <w:t>The first working transistor was demonstrated at Bell Labs in December 1947 by John Bardeen and Walter Brattain, with William Shockley leading the research group; all three later shared the Nobel Prize for it. The transistor could amplify and switch electrical signals. That changed everything.</w:t>
+        <w:t xml:space="preserve">The first working transistor was demonstrated at Bell Labs in 1947 by John Bardeen, Walter Brattain and William Shockley. The transistor could amplify and switch electrical signals. That changed everything.</w:t>
       </w:r>
     </w:p>
     <w:p>
@@ -3947,19 +3947,19 @@
           <w:sz w:val="22"/>
           <w:szCs w:val="22"/>
         </w:rPr>
-        <w:t>Combine transistors into circuits. Make gates: an AND gate switches on only when both its inputs are on, an OR gate switches on if either is, and a NOT gate just flips its input.</w:t>
-      </w:r>
-    </w:p>
-    <w:p>
-      <w:pPr>
-        <w:spacing w:after="120"/>
-      </w:pPr>
-      <w:r>
-        <w:rPr>
-          <w:sz w:val="22"/>
-          <w:szCs w:val="22"/>
-        </w:rPr>
-        <w:t>NAND. NOR. Wire enough of these together and you can build arithmetic units, memory, control systems and processors.</w:t>
+        <w:t xml:space="preserve">Combine transistors into circuits. Make gates. AND. OR.</w:t>
+      </w:r>
+    </w:p>
+    <w:p>
+      <w:pPr>
+        <w:spacing w:after="120"/>
+      </w:pPr>
+      <w:r>
+        <w:rPr>
+          <w:sz w:val="22"/>
+          <w:szCs w:val="22"/>
+        </w:rPr>
+        <w:t xml:space="preserve">NOT. NAND. NOR. Then combine those gates into arithmetic units, memory, control systems and processors.</w:t>
       </w:r>
     </w:p>
     <w:p>
@@ -4127,7 +4127,7 @@
           <w:sz w:val="22"/>
           <w:szCs w:val="22"/>
         </w:rPr>
-        <w:t>Semiconductors do more than switch. They can emit light. In an LED (light-emitting diode), electrons and holes recombine and can release energy as photons. The wavelength depends on the semiconductor's electronic structure.</w:t>
+        <w:t xml:space="preserve">Semiconductors do more than switch. They can emit light. In an LED, electrons and holes recombine and can release energy as photons. The wavelength depends on the semiconductor's electronic structure.</w:t>
       </w:r>
     </w:p>
     <w:p>
@@ -4373,7 +4373,7 @@
           <w:sz w:val="22"/>
           <w:szCs w:val="22"/>
         </w:rPr>
-        <w:t>All because electrons live in quantum energy bands. That is a spectacular amount of civilization to build on something that, at first glance, looks like a rather boring gray crystal. Silicon, it turns out, was never boring. We simply hadn't learned how to ask it the right question.</w:t>
+        <w:t xml:space="preserve">All because electrons live in quantum energy bands. That is a spectacular amount of civilization to build on something that, at first glance, looks like a rather boring grey crystal. Silicon, it turns out, was never boring. We simply hadn't learned how to ask it the right question.</w:t>
       </w:r>
     </w:p>
     <w:p>
@@ -4564,7 +4564,7 @@
           <w:sz w:val="22"/>
           <w:szCs w:val="22"/>
         </w:rPr>
-        <w:t>The tea climbs out of the carpet and jumps back inside. And then, without anyone touching it, the cup rises into your hand. You have just watched something the microscopic laws of physics don't actually forbid. And yet you would bet your house against it happening.</w:t>
+        <w:t xml:space="preserve">The tea climbs out of the carpet and jumps back inside. And then, without anyone touching it, the cup rises into your hand. You have just watched something that the microscopic laws of physics do not make obviously impossible. And yet you would bet your house against it happening.</w:t>
       </w:r>
     </w:p>
     <w:p>
@@ -4630,7 +4630,7 @@
           <w:sz w:val="22"/>
           <w:szCs w:val="22"/>
         </w:rPr>
-        <w:t>There are vastly more microscopic arrangements corresponding to a broken egg than to the intact egg. The universe has overwhelmingly many ways to be messy. It has extraordinarily few ways to be tidy. Physicists have a name for how many ways a thing can be arranged and still look the same from the outside: entropy. More ways to be messy means higher entropy.</w:t>
+        <w:t xml:space="preserve">There are vastly more microscopic arrangements corresponding to a broken egg than to the intact egg. The universe has overwhelmingly many ways to be messy. It has extraordinarily few ways to be tidy. And that difference is called entropy.</w:t>
       </w:r>
     </w:p>
     <w:p>
@@ -4660,7 +4660,7 @@
           <w:sz w:val="22"/>
           <w:szCs w:val="22"/>
         </w:rPr>
-        <w:t>We often hear that entropy means disorder. That is a useful introduction. But the deeper idea — first worked out by the physicist Ludwig Boltzmann, who was so sure of it that he had the formula carved on his own gravestone — is about the number of microscopic states compatible with what we observe macroscopically. A gas confined to one corner of a room has relatively few possibilities.</w:t>
+        <w:t xml:space="preserve">We often hear that entropy means disorder. That is a useful introduction. But the deeper idea is about the number of microscopic states compatible with what we observe macroscopically. A gas confined to one corner of a room has relatively few possibilities.</w:t>
       </w:r>
     </w:p>
     <w:p>
@@ -4768,7 +4768,7 @@
           <w:sz w:val="22"/>
           <w:szCs w:val="22"/>
         </w:rPr>
-        <w:t>Feynman liked to pose it as a challenge: if I showed you a film of the physical world, could you tell whether it was running forwards or backwards? For a single colliding pair of billiard balls, no — the laws of mechanics look the same either way. For a broken egg reassembling itself, yes, instantly, and that asymmetry is the whole puzzle. At the microscopic level, particles are moving and colliding. At the macroscopic level, we describe temperature, pressure and entropy. The second law is not a little mechanical commandment attached to every molecule.</w:t>
+        <w:t xml:space="preserve">Feynman repeatedly emphasized the statistical character of thermodynamics. At the microscopic level, particles are moving and colliding. At the macroscopic level, we describe temperature, pressure and entropy. The second law is not a little mechanical commandment attached to every molecule.</w:t>
       </w:r>
     </w:p>
     <w:p>
@@ -4888,19 +4888,19 @@
           <w:sz w:val="22"/>
           <w:szCs w:val="22"/>
         </w:rPr>
-        <w:t>Now the story becomes much bigger. If entropy tends to increase, then the early universe must have begun in an extraordinarily special state. The young universe was hot and dense. But gravitationally, that does not necessarily mean it was in a high-entropy state — and here the earlier intuition needs a twist. Gravity only pulls. So for matter under gravity, spreading out is not the high-entropy option; clumping is. A smooth, even gas has relatively few ways to rearrange itself before gravity starts pulling it into lumps; a universe full of dense clumps, stars, and — in the extreme case — black holes has vastly more ways to be arranged, which is exactly why black holes turn out to have the highest entropy of anything physics knows how to calculate.</w:t>
-      </w:r>
-    </w:p>
-    <w:p>
-      <w:pPr>
-        <w:spacing w:after="120"/>
-      </w:pPr>
-      <w:r>
-        <w:rPr>
-          <w:sz w:val="22"/>
-          <w:szCs w:val="22"/>
-        </w:rPr>
-        <w:t>The early universe, by contrast, was remarkably smooth — matter spread almost perfectly evenly, none of it yet clumped into stars or black holes. That smoothness is the special, low-probability state; gravity has been pulling it toward the messier, higher-entropy, clumpier arrangement ever since. The early universe appears to have had extremely low gravitational entropy. That special beginning may be what gives the universe its thermodynamic arrow. The question is no longer: “Why does entropy increase?”</w:t>
+        <w:t xml:space="preserve">Now the story becomes much bigger. If entropy tends to increase, then the early universe must have begun in an extraordinarily special state. The young universe was hot and dense. But gravitationally, that does not necessarily mean it was in a high-entropy state.</w:t>
+      </w:r>
+    </w:p>
+    <w:p>
+      <w:pPr>
+        <w:spacing w:after="120"/>
+      </w:pPr>
+      <w:r>
+        <w:rPr>
+          <w:sz w:val="22"/>
+          <w:szCs w:val="22"/>
+        </w:rPr>
+        <w:t xml:space="preserve">The early universe appears to have had extremely low gravitational entropy. That special beginning may be what gives the universe its thermodynamic arrow. The question is no longer: “Why does entropy increase?”</w:t>
       </w:r>
     </w:p>
     <w:p>
@@ -5364,7 +5364,7 @@
           <w:sz w:val="22"/>
           <w:szCs w:val="22"/>
         </w:rPr>
-        <w:t>Two bodies are comparatively polite. The Earth and Sun follow a beautifully understandable gravitational relationship. Add another massive body and things become much more interesting. The three-body problem has no general simple closed-form solution — no single tidy formula for the future — the way the two-body problem has.</w:t>
+        <w:t xml:space="preserve">Two bodies are comparatively polite. The Earth and Sun follow a beautifully understandable gravitational relationship. Add another massive body and things become much more interesting. The three-body problem has no general simple closed-form solution like the two-body problem.</w:t>
       </w:r>
     </w:p>
     <w:p>
@@ -5430,7 +5430,7 @@
           <w:sz w:val="22"/>
           <w:szCs w:val="22"/>
         </w:rPr>
-        <w:t>And the atmosphere is nonlinear — small causes don't stay small, and effects can snowball out of proportion to their causes. A minuscule difference can grow. The forecast may be excellent tomorrow and hopeless weeks from now. This is why long-range weather prediction has a fundamental difficulty that is not solved merely by buying a faster computer.</w:t>
+        <w:t xml:space="preserve">And the atmosphere is nonlinear. A minuscule difference can grow. The forecast may be excellent tomorrow and hopeless weeks from now. This is why long-range weather prediction has a fundamental difficulty that is not solved merely by buying a faster computer.</w:t>
       </w:r>
     </w:p>
     <w:p>
@@ -5472,7 +5472,7 @@
           <w:sz w:val="22"/>
           <w:szCs w:val="22"/>
         </w:rPr>
-        <w:t>In 1961, meteorologist Edward Lorenz was running a twelve-variable numerical weather model when he restarted a calculation using numbers that were almost—but not quite—the same. The resulting trajectory eventually diverged dramatically. A tiny numerical difference had produced a completely different weather-like evolution.</w:t>
+        <w:t xml:space="preserve">In the 1960s, meteorologist Edward Lorenz was exploring simplified models of atmospheric convection. He restarted a calculation using numbers that were almost—but not quite—the same. The resulting trajectory eventually diverged dramatically. A tiny numerical difference had produced a completely different weather-like evolution.</w:t>
       </w:r>
     </w:p>
     <w:p>
@@ -5514,19 +5514,19 @@
           <w:sz w:val="22"/>
           <w:szCs w:val="22"/>
         </w:rPr>
-        <w:t>Two years later, in 1963, Lorenz distilled the same phenomenon into a much simpler model: just three equations describing atmospheric convection. That system produced a remarkable geometric structure in what's called phase space — not physical space, but a map of every possible combination of the system's variables at a given moment. Trajectories did not settle into a simple repeating orbit. They did not wander randomly either. They remained confined to a complicated structure now famously associated with the Lorenz attractor.</w:t>
-      </w:r>
-    </w:p>
-    <w:p>
-      <w:pPr>
-        <w:spacing w:after="120"/>
-      </w:pPr>
-      <w:r>
-        <w:rPr>
-          <w:sz w:val="22"/>
-          <w:szCs w:val="22"/>
-        </w:rPr>
-        <w:t>It looked almost like the wings of a butterfly — a striking coincidence, since the name “butterfly effect” actually comes from the title of a 1972 talk in which Lorenz asked whether a butterfly flapping its wings in Brazil could set off a tornado in Texas. But the real surprise was deeper: order and unpredictability could coexist.</w:t>
+        <w:t xml:space="preserve">Lorenz's system produced a remarkable geometric structure in phase space. Trajectories did not settle into a simple repeating orbit. They did not wander randomly either. They remained confined to a complicated structure now famously associated with the Lorenz attractor.</w:t>
+      </w:r>
+    </w:p>
+    <w:p>
+      <w:pPr>
+        <w:spacing w:after="120"/>
+      </w:pPr>
+      <w:r>
+        <w:rPr>
+          <w:sz w:val="22"/>
+          <w:szCs w:val="22"/>
+        </w:rPr>
+        <w:t xml:space="preserve">It looked almost like the wings of a butterfly. The butterfly finally earned the metaphor. But the real surprise was deeper: order and unpredictability could coexist.</w:t>
       </w:r>
     </w:p>
     <w:p>
@@ -5610,7 +5610,7 @@
           <w:sz w:val="22"/>
           <w:szCs w:val="22"/>
         </w:rPr>
-        <w:t>Take a simple pendulum. Small swings are beautifully predictable. But drive a pendulum strongly, especially with periodic forcing — a regular, repeated push, in time with (or against) its swing — and the motion can become chaotic. The same physical object.</w:t>
+        <w:t xml:space="preserve">Take a simple pendulum. Small swings are beautifully predictable. But drive a pendulum strongly, especially with periodic forcing, and the motion can become chaotic. The same physical object.</w:t>
       </w:r>
     </w:p>
     <w:p>
@@ -5868,7 +5868,7 @@
           <w:sz w:val="22"/>
           <w:szCs w:val="22"/>
         </w:rPr>
-        <w:t>Imagine an omniscient calculator that knew the exact laws. Would it know the future? If it also knew the exact state of everything with infinite precision, then in an idealized classical system, the equations might, in principle, allow it to calculate the future. But real physical systems contain quantum effects, measurement limits and enormous complexity.</w:t>
+        <w:t xml:space="preserve">Imagine an omniscient calculator that knew the exact laws. Would it know the future? If it also knew the exact state with infinite precision, classical deterministic equations might allow that in an idealized system. But real physical systems contain quantum effects, measurement limits and enormous complexity.</w:t>
       </w:r>
     </w:p>
     <w:p>
@@ -6272,7 +6272,7 @@
           <w:sz w:val="22"/>
           <w:szCs w:val="22"/>
         </w:rPr>
-        <w:t>A particle is what happens when a field gets excited. But the absence of excitation doesn't mean the absence of a field — it means the field is sitting in its lowest possible energy state. That state is called the vacuum. And “lowest” does not mean “zero.”</w:t>
+        <w:t xml:space="preserve">A particle is what happens when a field gets excited. No excitation does not mean no field. It means the field is sitting in its lowest possible energy state. That state is called the vacuum. And “lowest” does not mean “zero.”</w:t>
       </w:r>
     </w:p>
     <w:p>
@@ -6314,7 +6314,7 @@
           <w:sz w:val="22"/>
           <w:szCs w:val="22"/>
         </w:rPr>
-        <w:t>This jitter has a name: zero-point energy. It is not a malfunction. It is the entrance fee for living in a quantum universe. It turns out that even “nothing” comes with a minimum energy price tag.</w:t>
+        <w:t xml:space="preserve">This jitter has a name: zero-point energy. It is not a malfunction. It is the entrance fee for living in a quantum universe. Nothing, it turns out, comes with a minimum energy requirement.</w:t>
       </w:r>
     </w:p>
     <w:p>
@@ -6356,7 +6356,7 @@
           <w:sz w:val="22"/>
           <w:szCs w:val="22"/>
         </w:rPr>
-        <w:t>They are not detected directly, the way an ordinary particle is. But their fingerprints are all over the mathematics of quantum field theory, and increasingly, in the laboratory.</w:t>
+        <w:t xml:space="preserve">These are virtual particles. They are not detected directly, the way an ordinary particle is. But their fingerprints are all over the mathematics of quantum field theory, and increasingly, in the laboratory.</w:t>
       </w:r>
     </w:p>
     <w:p>
@@ -6398,7 +6398,7 @@
           <w:sz w:val="22"/>
           <w:szCs w:val="22"/>
         </w:rPr>
-        <w:t>Casimir predicted they would be pushed together anyway. The usual way to picture it: much like a guitar string of fixed length can only vibrate at certain wavelengths, the plates restrict which virtual photon modes can exist in the gap between them, while modes outside the plates are unrestricted — and that imbalance produces a small but measurable force. Physicists can derive that same real, measured number a few different ways — the virtual-photon picture is popular because it's vivid, not because it's the only road to the answer.</w:t>
+        <w:t xml:space="preserve">Casimir predicted they would be pushed together anyway. The usual way to picture it: the plates restrict which virtual photon modes can exist in the gap between them, while modes outside the plates are unrestricted, and the imbalance produces a small but measurable force. Physicists can derive that same real, measured number a few different ways — the virtual-photon picture is popular because it's vivid, not because it's the only road to the answer.</w:t>
       </w:r>
     </w:p>
     <w:p>
@@ -6428,7 +6428,7 @@
           <w:sz w:val="36"/>
           <w:szCs w:val="36"/>
         </w:rPr>
-        <w:t>Doing the Math</w:t>
+        <w:t xml:space="preserve">Doing the Sums</w:t>
       </w:r>
     </w:p>
     <w:p>
@@ -6482,19 +6482,19 @@
           <w:sz w:val="22"/>
           <w:szCs w:val="22"/>
         </w:rPr>
-        <w:t>Compare that theoretical number to what cosmology observes, and the two disagree by as much as 120 orders of magnitude, depending on where the calculation is cut off. Not twice as large. Not a thousand times too large. A number so large it is easier to write as an exponent than to say out loud — each order of magnitude is another factor of ten, and a hundred and twenty of them is a 1 followed by 120 zeros.</w:t>
-      </w:r>
-    </w:p>
-    <w:p>
-      <w:pPr>
-        <w:spacing w:after="120"/>
-      </w:pPr>
-      <w:r>
-        <w:rPr>
-          <w:sz w:val="22"/>
-          <w:szCs w:val="22"/>
-        </w:rPr>
-        <w:t>This is the cosmological constant problem — sometimes called the worst quantitative prediction in the history of physics. Something must be canceling almost all of that vacuum energy. Nobody has a confirmed explanation for why the cancellation is not complete, or why what remains has the tiny value it does.</w:t>
+        <w:t xml:space="preserve">Compare that theoretical number to what cosmology observes, and the two disagree by as much as 120 orders of magnitude, depending on where the calculation is cut off. Not twice as large. Not a thousand times too large. A number so large it is easier to write as an exponent than to say out loud.</w:t>
+      </w:r>
+    </w:p>
+    <w:p>
+      <w:pPr>
+        <w:spacing w:after="120"/>
+      </w:pPr>
+      <w:r>
+        <w:rPr>
+          <w:sz w:val="22"/>
+          <w:szCs w:val="22"/>
+        </w:rPr>
+        <w:t xml:space="preserve">This is the cosmological constant problem — sometimes called the worst quantitative prediction in the history of physics. Something must be cancelling almost all of that vacuum energy. Nobody has a confirmed explanation for why the cancellation is not complete, or why what remains has the tiny value it does.</w:t>
       </w:r>
     </w:p>
     <w:p>
@@ -7003,7 +7003,7 @@
           <w:sz w:val="22"/>
           <w:szCs w:val="22"/>
         </w:rPr>
-        <w:t>There was a problem. The mathematics of superstring theory — string theory combined with supersymmetry, introduced below — works consistently only in a spacetime with more dimensions than the four we experience directly. Ten dimensions, in the most common superstring formulation — other formulations, and other string theories, land on other numbers, which is its own small headache. Ten, for now.</w:t>
+        <w:t xml:space="preserve">There was a problem. The mathematics of superstring theory works consistently only in a spacetime with more dimensions than the four we experience directly. Ten dimensions, in the most common superstring formulation — other formulations, and other string theories, land on other numbers, which is its own small headache. Ten, for now.</w:t>
       </w:r>
     </w:p>
     <w:p>
@@ -7165,7 +7165,7 @@
           <w:sz w:val="22"/>
           <w:szCs w:val="22"/>
         </w:rPr>
-        <w:t>In 1995, Edward Witten gave the situation a remarkable new interpretation. The five string theories, together with eleven-dimensional supergravity — a theory that extends Einstein's gravity with supersymmetry — in the appropriate limits, appeared to be connected through a deeper framework. This became known as M-theory. The “M” has never been given one universally agreed official expansion.</w:t>
+        <w:t xml:space="preserve">In 1995, Edward Witten gave the situation a remarkable new interpretation. The five string theories, together with eleven-dimensional supergravity in the appropriate limits, appeared to be connected through a deeper framework. This became known as M-theory. The “M” has never been given one universally agreed official expansion.</w:t>
       </w:r>
     </w:p>
     <w:p>
@@ -7465,7 +7465,7 @@
           <w:sz w:val="22"/>
           <w:szCs w:val="22"/>
         </w:rPr>
-        <w:t>Different vacuum energies. Perhaps this is a profound feature of the theory. Perhaps it is a sign that we have not yet found the correct principle selecting our universe. Perhaps some anthropic reasoning is required — the idea that we should only expect to find ourselves in one of the rare universes whose laws permit observers to exist.</w:t>
+        <w:t xml:space="preserve">Different vacuum energies. Perhaps this is a profound feature of the theory. Perhaps it is a sign that we have not yet found the correct principle selecting our universe. Perhaps some anthropic reasoning is required.</w:t>
       </w:r>
     </w:p>
     <w:p>
@@ -7549,7 +7549,7 @@
           <w:sz w:val="22"/>
           <w:szCs w:val="22"/>
         </w:rPr>
-        <w:t>Black holes led to an even deeper problem. If something falls into a black hole, what happens to its information? Quantum mechanics says information should not simply disappear. Quantum effects seem to let a black hole evaporate anyway, slowly leaking itself away as Hawking radiation — a faint quantum glow Stephen Hawking predicted every black hole should emit, even though classical general relativity says nothing is supposed to escape one.</w:t>
+        <w:t xml:space="preserve">Black holes led to an even deeper problem. If something falls into a black hole, what happens to its information? Quantum mechanics says information should not simply disappear. Classical general relativity seems to allow a black hole to evaporate anyway, slowly leaking itself away as Hawking radiation — a faint quantum glow Stephen Hawking predicted every black hole should emit, even though nothing is supposed to escape one.</w:t>
       </w:r>
     </w:p>
     <w:p>
@@ -7591,7 +7591,7 @@
           <w:sz w:val="22"/>
           <w:szCs w:val="22"/>
         </w:rPr>
-        <w:t>Then came one of the most astonishing ideas in modern theoretical physics. In 1997, Juan Maldacena proposed the AdS/CFT correspondence — “CFT” stands for conformal field theory, a quantum theory with a special kind of symmetry. Very roughly, a gravitational theory in a higher-dimensional Anti-de Sitter spacetime (AdS) can be mathematically equivalent to a conformal field theory without gravity living on its lower-dimensional boundary. Two descriptions.</w:t>
+        <w:t xml:space="preserve">Then came one of the most astonishing ideas in modern theoretical physics. In 1997, Juan Maldacena proposed the AdS/CFT correspondence. Very roughly, a gravitational theory in a higher-dimensional Anti-de Sitter spacetime can be mathematically equivalent to a quantum field theory without gravity living on its lower-dimensional boundary. Two descriptions.</w:t>
       </w:r>
     </w:p>
     <w:p>
@@ -7645,7 +7645,7 @@
           <w:sz w:val="22"/>
           <w:szCs w:val="22"/>
         </w:rPr>
-        <w:t>If a gravitational world can be equivalent to a nongravitational quantum theory living on its boundary, perhaps gravity and spacetime are not fundamental in the way we assumed. Perhaps geometry emerges from quantum information. Perhaps entanglement — the strange quantum link where measuring one particle instantly narrows the odds for a distant partner particle — helps determine the structure of spacetime. Picture an ordinary hologram: a flat surface encoded so that it projects a three-dimensional image. AdS/CFT hints that something structurally similar might be true of the universe itself — that space, and gravity along with it, could be a projection built from quantum information on a lower-dimensional surface, rather than a basic ingredient in its own right. Perhaps the fabric of the universe is not made from tiny pieces of space.</w:t>
+        <w:t xml:space="preserve">If a gravitational world can be equivalent to a nongravitational quantum theory living on its boundary, perhaps gravity and spacetime are not fundamental in the way we assumed. Perhaps geometry emerges from quantum information. Perhaps entanglement helps determine the structure of spacetime. Perhaps the fabric of the universe is not made from tiny pieces of space.</w:t>
       </w:r>
     </w:p>
     <w:p>
@@ -8043,7 +8043,7 @@
           <w:sz w:val="22"/>
           <w:szCs w:val="22"/>
         </w:rPr>
-        <w:t>This is not established, mainstream physics — it is one physicist's speculative research program. Christoph Schiller developed it in detail in his self-published Motion Mountain physics series; unlike string theory, it has not been taken up broadly by the theoretical-physics community. That distinction is important. We are going to explore the idea because it is interesting — not because the universe, or the physics community, has signed the contract. It gets four chapters here, more space than the far more mainstream string theory, for exactly that reason: it's an unusually clear, self-contained example of how to think about speculative physics in general — not a sign that it's more likely to be right.</w:t>
+        <w:t xml:space="preserve">This is not established, mainstream physics — it is one physicist's speculative research program. Christoph Schiller developed it in detail in his self-published Motion Mountain physics series; unlike string theory, it has not been taken up broadly by the theoretical-physics community. That distinction is important. We are going to explore the idea because it is interesting — not because the universe, or the physics community, has signed the contract.</w:t>
       </w:r>
     </w:p>
     <w:p>
@@ -8073,7 +8073,7 @@
           <w:sz w:val="22"/>
           <w:szCs w:val="22"/>
         </w:rPr>
-        <w:t>In ordinary particle physics, an electron is elementary. In the strand picture, the electron could instead be a stable topological configuration — topology, the branch of mathematics about shapes that survive stretching and bending without cutting, gets its own proper introduction next chapter. The identity of the particle would come from the structure of the tangle. Change the tangle and you change the particle.</w:t>
+        <w:t xml:space="preserve">In ordinary particle physics, an electron is elementary. In the strand picture, the electron could instead be a stable topological configuration. The identity of the particle would come from the structure of the tangle. Change the tangle and you change the particle.</w:t>
       </w:r>
     </w:p>
     <w:p>
@@ -8381,19 +8381,19 @@
           <w:sz w:val="22"/>
           <w:szCs w:val="22"/>
         </w:rPr>
-        <w:t>Take a belt. Hold one end fixed — imagine it's attached to the rest of the universe. Rotate the other end, the one standing in for a particle, through 360 degrees. The belt is twisted.</w:t>
-      </w:r>
-    </w:p>
-    <w:p>
-      <w:pPr>
-        <w:spacing w:after="120"/>
-      </w:pPr>
-      <w:r>
-        <w:rPr>
-          <w:sz w:val="22"/>
-          <w:szCs w:val="22"/>
-        </w:rPr>
-        <w:t>Rotate it another 360 degrees. Now, with a suitable motion, you can untwist it without rotating the fixed end. This sounds like a party trick. It is actually topology. The belt's twist is standing in for something real: a particle's connection to everything around it, which can get tangled by a single full rotation and only comes untangled after two.</w:t>
+        <w:t xml:space="preserve">Take a belt. Hold one end. Rotate the other end through 360 degrees. The belt is twisted.</w:t>
+      </w:r>
+    </w:p>
+    <w:p>
+      <w:pPr>
+        <w:spacing w:after="120"/>
+      </w:pPr>
+      <w:r>
+        <w:rPr>
+          <w:sz w:val="22"/>
+          <w:szCs w:val="22"/>
+        </w:rPr>
+        <w:t xml:space="preserve">Rotate it another 360 degrees. Now, with a suitable motion, you can untwist it without rotating the fixed end. This sounds like a party trick. It is actually topology.</w:t>
       </w:r>
     </w:p>
     <w:p>
@@ -8435,7 +8435,7 @@
           <w:sz w:val="22"/>
           <w:szCs w:val="22"/>
         </w:rPr>
-        <w:t>Every particle carries a built-in quantity called spin — not literal spinning, but a fixed, intrinsic amount of angular momentum every particle of a given type carries, the same way every electron carries the same electric charge. Quantum particles called fermions behave in a peculiar way under rotations. Rotate a spin-½ state a full 360 degrees, and it doesn't come back to where it started — it comes back flipped, carrying a minus sign relative to the original. Only a second full turn, 720 degrees in total, erases that sign and returns the state to exactly where it began. That is exactly the belt's trick, played out on a quantum particle instead of a strip of leather. That sounds impossible if you imagine a tiny spinning ball. But an electron is not a tiny spinning ball.</w:t>
+        <w:t xml:space="preserve">Quantum particles called fermions behave in a peculiar way under rotations. Rotate a spin-½ state a full 360 degrees, and it doesn't come back to where it started — it comes back flipped, carrying a minus sign relative to the original. Only a second full turn, 720 degrees in total, erases that sign and returns the state to exactly where it began. That sounds impossible if you imagine a tiny spinning ball. But an electron is not a tiny spinning ball.</w:t>
       </w:r>
     </w:p>
     <w:p>
@@ -8827,7 +8827,7 @@
           <w:sz w:val="22"/>
           <w:szCs w:val="22"/>
         </w:rPr>
-        <w:t>The electroweak theory uses SU(2) × U(1). Think of U(1), SU(2) and SU(3) as different families of internal rotation — each names a different shape of symmetry: U(1) is round the way a circle is round, SU(2) the way a sphere is round, and SU(3) a higher-dimensional kind of roundness that no everyday object can quite model. That picture buys a feeling for why there are exactly three separate structures, not what makes any one of them true; the actual content lives in equations, and no metaphor is a substitute for them. These mathematical structures are enormously successful. They predict and organize real physics.</w:t>
+        <w:t xml:space="preserve">The electroweak theory uses SU(2) × U(1). Think of U(1), SU(2) and SU(3) as different families of internal rotation — each names a different shape of symmetry, the way a circle and a sphere are both round but round in different ways. That picture buys a feeling for why there are exactly three separate structures, not what makes any one of them true; the actual content lives in equations, and no metaphor is a substitute for them. These mathematical structures are enormously successful. They predict and organize real physics.</w:t>
       </w:r>
     </w:p>
     <w:p>
@@ -8857,7 +8857,7 @@
           <w:sz w:val="22"/>
           <w:szCs w:val="22"/>
         </w:rPr>
-        <w:t>The strand model proposes that some of this structure might emerge from the properties of tiny strand crossings—orientation, twisting, quantum phase (a kind of internal clock-position every quantum state carries), and topology. That is the entire mechanism as it currently stands — nobody, including its proponent, has yet shown how those four words turn into the specific SU(3) × SU(2) × U(1) structure the Standard Model actually has. If such a mechanism worked, gauge fields would not be fundamental ingredients inserted into the theory. They would be large-scale consequences of the microscopic structure. That is a beautiful possibility.</w:t>
+        <w:t xml:space="preserve">The strand model proposes that some of this structure might emerge from the properties of tiny strand crossings—orientation, twisting, phase and topology. That is the entire mechanism as it currently stands — nobody, including its proponent, has yet shown how those four words turn into the specific SU(3) × SU(2) × U(1) structure the Standard Model actually has. If such a mechanism worked, gauge fields would not be fundamental ingredients inserted into the theory. They would be large-scale consequences of the microscopic structure. That is a beautiful possibility.</w:t>
       </w:r>
     </w:p>
     <w:p>
@@ -9363,7 +9363,7 @@
           <w:sz w:val="22"/>
           <w:szCs w:val="22"/>
         </w:rPr>
-        <w:t>WHAT WE KNOW: Each previous unification in physics — Newton, Maxwell, Einstein, the Standard Model — was confirmed by experiment, not by elegance alone. WHAT IS SERIOUS BUT UNCONFIRMED: Whether a single unifying principle beneath the Standard Model and general relativity exists at all. WHAT IS SPECULATIVE: The strand model — physicist Christoph Schiller's speculative unification proposal — as a candidate for that principle. WHAT WOULD MATTER: A successful, risky prediction the strand model makes and rival ideas don't.</w:t>
+        <w:t xml:space="preserve">The strand model — physicist Christoph Schiller's speculative unification proposal — should therefore be treated as a research program. Not established fact. Not nonsense. Not proven.</w:t>
       </w:r>
     </w:p>
     <w:p>
@@ -9617,7 +9617,7 @@
           <w:sz w:val="22"/>
           <w:szCs w:val="22"/>
         </w:rPr>
-        <w:t>Bell's theorem transformed a philosophical argument — whether particles secretly have definite properties all along, before anyone measures them, or whether quantum mechanics' fuzziness is genuinely fundamental — into experimentally testable inequalities. Experiments violated Bell inequalities, ruling out that whole class of “secretly definite all along” theories. That is evidence. Not because Bell was famous.</w:t>
+        <w:t xml:space="preserve">Bell's theorem transformed a philosophical argument about quantum mechanics into experimentally testable inequalities. Experiments violated Bell inequalities. That is evidence. Not because Bell was famous.</w:t>
       </w:r>
     </w:p>
     <w:p>
@@ -9726,11 +9726,6 @@
           <w:szCs w:val="22"/>
         </w:rPr>
         <w:t xml:space="preserve">A claim that cannot be tested, defined or meaningfully confronted with evidence. The colors are not insults. They are intellectual seat belts.</w:t>
-      </w:r>
-    </w:p>
-    <w:p>
-      <w:r>
-        <w:t>Sort the last few chapters through those boxes and the picture sharpens: general relativity and the Standard Model are GREEN. String theory and M-theory are YELLOW. The strand model is ORANGE. Nothing in this book has needed the RED box yet — every idea covered, however speculative, has at least been framed as testable in principle. These four boxes, incidentally, are the same categories every “Physics Status Check” in the last several chapters has been quietly sorting things into, just relabeled with colors instead of headers.</w:t>
       </w:r>
     </w:p>
     <w:p>
@@ -10245,7 +10240,7 @@
           <w:sz w:val="22"/>
           <w:szCs w:val="22"/>
         </w:rPr>
-        <w:t>When physicists say “emergent,” they are not quietly introducing a new force called Emergence. A hurricane emerges from ordinary molecules. A crystal emerges from atoms. Superconductivity — electricity flowing with zero resistance — emerges from collective quantum behavior.</w:t>
+        <w:t xml:space="preserve">When physicists say “emergent,” they are not quietly introducing a new force called Emergence. A hurricane emerges from ordinary molecules. A crystal emerges from atoms. Superconductivity emerges from collective quantum behavior.</w:t>
       </w:r>
     </w:p>
     <w:p>
@@ -10341,7 +10336,7 @@
           <w:sz w:val="22"/>
           <w:szCs w:val="22"/>
         </w:rPr>
-        <w:t>Computer scientists discovered something delightfully annoying. You can write down extremely simple rules and get behavior that is spectacularly complicated — Conway's Game of Life, a grid of on/off cells following four simple rules, is the classic case. A minuscule program can generate patterns that take pages to describe. A deterministic system can become unpredictable in practice.</w:t>
+        <w:t xml:space="preserve">Computer scientists discovered something delightfully annoying. You can write down extremely simple rules and get behavior that is spectacularly complicated. A minuscule program can generate patterns that take pages to describe. A deterministic system can become unpredictable in practice.</w:t>
       </w:r>
     </w:p>
     <w:p>
@@ -10827,7 +10822,7 @@
           <w:sz w:val="22"/>
           <w:szCs w:val="22"/>
         </w:rPr>
-        <w:t>We do not yet have a generally accepted theory explaining why physical information processing should produce subjective experience. The cognitive scientist Douglas Hofstadter's work suggests that self-reference and recursive representation may be important. Interesting? Very.</w:t>
+        <w:t xml:space="preserve">We do not yet have a generally accepted theory explaining why physical information processing should produce subjective experience. Hofstadter's work suggests that self-reference and recursive representation may be important. Interesting? Very.</w:t>
       </w:r>
     </w:p>
     <w:p>
@@ -11315,7 +11310,19 @@
           <w:sz w:val="22"/>
           <w:szCs w:val="22"/>
         </w:rPr>
-        <w:t>Einstein was spectacularly good at asking ridiculous-sounding questions. What if you chased a beam of light? What would two observers see? What happens to a clock on a moving train? What does an accelerating observer experience? No train ticket required. Each of these, chased far enough, forces a real theory to change — chasing the beam of light helped deliver special relativity; the accelerating observer helped deliver general relativity. These thought experiments expose hidden assumptions. Sometimes the result is a new theory. The one worth walking through in full is the simplest: the moving train.</w:t>
+        <w:t xml:space="preserve">Einstein was spectacularly good at asking ridiculous-sounding questions. What if you chased a beam of light? What would two observers see? What happens to a clock on a moving train?</w:t>
+      </w:r>
+    </w:p>
+    <w:p>
+      <w:pPr>
+        <w:spacing w:after="120"/>
+      </w:pPr>
+      <w:r>
+        <w:rPr>
+          <w:sz w:val="22"/>
+          <w:szCs w:val="22"/>
+        </w:rPr>
+        <w:t xml:space="preserve">What does an accelerating observer experience? No train ticket required. These thought experiments expose hidden assumptions. Sometimes the result is a new theory.</w:t>
       </w:r>
     </w:p>
     <w:p>
@@ -12391,7 +12398,7 @@
           <w:sz w:val="22"/>
           <w:szCs w:val="22"/>
         </w:rPr>
-        <w:t>Gödel's incompleteness theorems are about formal mathematical systems. They are not a magic wand proving that physics is wrong. But they teach a wonderfully uncomfortable lesson. A sufficiently powerful formal system can contain statements whose truth cannot simply be settled from inside that system using its own formal machinery — Gödel's own construction was, roughly, a mathematical statement that translates to “this statement cannot be proved true within this system,” built so carefully that the system can neither prove it nor disprove it without contradicting itself.</w:t>
+        <w:t xml:space="preserve">Gödel's incompleteness theorems are about formal mathematical systems. They are not a magic wand proving that physics is wrong. But they teach a wonderfully uncomfortable lesson. A sufficiently powerful formal system can contain statements whose truth cannot simply be settled from inside that system using its own formal machinery.</w:t>
       </w:r>
     </w:p>
     <w:p>
@@ -12541,19 +12548,19 @@
           <w:sz w:val="22"/>
           <w:szCs w:val="22"/>
         </w:rPr>
-        <w:t>“This sentence is false” — the ancient Liar's Paradox, a cousin of Gödel's idea but not quite the same construction — is a famous self-reference disaster. It eats its own tail and gets a headache. But self-reference does not always produce contradiction. A computer can inspect its own program.</w:t>
-      </w:r>
-    </w:p>
-    <w:p>
-      <w:pPr>
-        <w:spacing w:after="120"/>
-      </w:pPr>
-      <w:r>
-        <w:rPr>
-          <w:sz w:val="22"/>
-          <w:szCs w:val="22"/>
-        </w:rPr>
-        <w:t>A thermostat can respond to the state it is helping regulate. A brain can think about its own thoughts. A scientific instrument can be used to check its own calibration. The important question is what kind of loop we have.</w:t>
+        <w:t xml:space="preserve">“This sentence is false” is a famous self-reference disaster. It eats its own tail and gets a headache. But self-reference does not always produce contradiction. A computer can inspect its own program.</w:t>
+      </w:r>
+    </w:p>
+    <w:p>
+      <w:pPr>
+        <w:spacing w:after="120"/>
+      </w:pPr>
+      <w:r>
+        <w:rPr>
+          <w:sz w:val="22"/>
+          <w:szCs w:val="22"/>
+        </w:rPr>
+        <w:t xml:space="preserve">A thermostat can respond to the state it is helping regulate. A brain can think about its own thoughts. A scientific instrument can measure another instrument. The important question is what kind of loop we have.</w:t>
       </w:r>
     </w:p>
     <w:p>
@@ -12787,7 +12794,7 @@
           <w:sz w:val="22"/>
           <w:szCs w:val="22"/>
         </w:rPr>
-        <w:t>A map is not the landscape. A simulation of a hurricane is not wet. An equation describing a black hole does not contain a tiny black hole. A quantum wavefunction is not a tiny object; it is a description of possibilities.</w:t>
+        <w:t xml:space="preserve">A map is not the landscape. A simulation of a hurricane is not wet. An equation describing a black hole does not contain a tiny black hole. A quantum state is not necessarily a little classical object hiding inside mathematics.</w:t>
       </w:r>
     </w:p>
     <w:p>
@@ -13057,7 +13064,7 @@
           <w:sz w:val="22"/>
           <w:szCs w:val="22"/>
         </w:rPr>
-        <w:t>Hofstadter's strange-loop ideas are not an established fundamental theory of physics. Gödel does not explain consciousness. Escher does not prove quantum mechanics. And the fact that the universe contains observers does not prove that observers are required for the universe to exist — the trap the anthropic principle warns against.</w:t>
+        <w:t xml:space="preserve">Hofstadter's strange-loop ideas are not an established fundamental theory of physics. Gödel does not explain consciousness. Escher does not prove quantum mechanics. And the fact that the universe contains observers does not prove that observers are required for the universe to exist.</w:t>
       </w:r>
     </w:p>
     <w:p>
@@ -13319,7 +13326,7 @@
           <w:sz w:val="22"/>
           <w:szCs w:val="22"/>
         </w:rPr>
-        <w:t>Further out, this book followed physics past the edge of what has been measured. String theory. The stranger, more speculative idea that particles might be knots in some deeper structure. Whether the forces themselves might be geometry in disguise, and whether one tiny rule could lie beneath all of it. Along the way, this book asked a harder question than any single theory: how do you tell a crazy idea that might be science from one that isn't?</w:t>
+        <w:t xml:space="preserve">Further out, this book followed physics past the edge of what has been measured. String theory. The stranger, more speculative idea that particles might be knots in some deeper structure.</w:t>
       </w:r>
     </w:p>
     <w:p>
@@ -13654,11 +13661,6 @@
       </w:r>
     </w:p>
     <w:p>
-      <w:r>
-        <w:t>Whether one microscopic rule could underlie particles, forces, and gravity all at once. An old ambition wearing new mathematics — beautiful if true, unproven either way.</w:t>
-      </w:r>
-    </w:p>
-    <w:p>
       <w:pPr>
         <w:pStyle w:val="Heading2"/>
         <w:spacing w:after="80" w:before="200"/>
@@ -13713,11 +13715,6 @@
       </w:r>
     </w:p>
     <w:p>
-      <w:r>
-        <w:t>How to tell a genuinely speculative idea from a settled one — and from one that isn't science at all.</w:t>
-      </w:r>
-    </w:p>
-    <w:p>
       <w:pPr>
         <w:pStyle w:val="Heading2"/>
         <w:spacing w:after="80" w:before="200"/>
@@ -13756,7 +13753,7 @@
           <w:sz w:val="22"/>
           <w:szCs w:val="22"/>
         </w:rPr>
-        <w:t>A sugar cube's worth of neutron-star material weighs about as much as a mountain. Before you look anything up: how many zeros do you think separate the weight of an ordinary sugar cube from the weight of a mountain? Then check how far off your gut was.</w:t>
+        <w:t xml:space="preserve">A sugar cube's worth of neutron-star material weighs about as much as a mountain. Before you look anything up: how many zeros do you think separate “sugar cube” from “mountain”? Then check how far off your gut was.</w:t>
       </w:r>
     </w:p>
     <w:p>

</xml_diff>

<commit_message>
Physics, Actually audit: series name in Vols 2-3 and plan, physics/number fixes, cross-reference fixes, Vol 3 ISBN check digits; backups 20261001-1900
</commit_message>
<xml_diff>
--- a/Science Books/Physics/Volume 3/Physics Vol 3 - The Standard Model, Chaos, and the Edge of Knowledge.docx
+++ b/Science Books/Physics/Volume 3/Physics Vol 3 - The Standard Model, Chaos, and the Edge of Knowledge.docx
@@ -16,7 +16,7 @@
           <w:sz w:val="56"/>
           <w:szCs w:val="56"/>
         </w:rPr>
-        <w:t xml:space="preserve">Science for Everyone</w:t>
+        <w:t xml:space="preserve">Physics, Actually</w:t>
       </w:r>
     </w:p>
     <w:p>
@@ -2645,7 +2645,7 @@
           <w:sz w:val="22"/>
           <w:szCs w:val="22"/>
         </w:rPr>
-        <w:t xml:space="preserve">Neutrinos are electrically neutral leptons. They interact through the weak interaction and gravity, but not through electromagnetism or the strong interaction. That makes them extraordinarily difficult to detect. Billions of neutrinos pass through your body every second.</w:t>
+        <w:t xml:space="preserve">Neutrinos are electrically neutral leptons. They interact through the weak interaction and gravity, but not through electromagnetism or the strong interaction. That makes them extraordinarily difficult to detect. Hundreds of trillions of neutrinos pass through your body every second.</w:t>
       </w:r>
     </w:p>
     <w:p>
@@ -3077,7 +3077,7 @@
           <w:sz w:val="22"/>
           <w:szCs w:val="22"/>
         </w:rPr>
-        <w:t xml:space="preserve">The Higgs boson was never seen directly, and never will be. It lives for about 10⁻²² seconds, too short to travel even the width of an atomic nucleus before it decays. What physicists saw were its decay products, and a statistical bump.</w:t>
+        <w:t xml:space="preserve">The Higgs boson was never seen directly, and never will be. It lives for about 10⁻²² seconds, too short to cross even a thousandth of the width of an atom before it decays. What physicists saw were its decay products, and a statistical bump.</w:t>
       </w:r>
     </w:p>
     <w:p>
@@ -3841,7 +3841,7 @@
           <w:sz w:val="22"/>
           <w:szCs w:val="22"/>
         </w:rPr>
-        <w:t xml:space="preserve">One family of ten had a hole in it. The pattern demanded a particle with negative charge, an unusual property called strangeness of minus three, and a mass of about 1,680 million electron volts. At a conference at CERN in 1962, Gell-Mann stood up and predicted it, naming it the omega-minus. In 1964 a team at Brookhaven National Laboratory, analyzing about 100,000 photographs from a bubble chamber, found one event with exactly the predicted particle, at almost exactly the predicted mass. The symmetry had been right, and two years later the idea behind it, that these particles are built from quarks, was on its way.</w:t>
+        <w:t xml:space="preserve">One family of ten had a hole in it. The pattern demanded a particle with negative charge, an unusual property called strangeness of minus three, and a mass of about 1,680 million electron volts. At a conference at CERN in 1962, Gell-Mann stood up and predicted it, naming it the omega-minus. In 1964 a team at Brookhaven National Laboratory, analyzing about 100,000 photographs from a bubble chamber, found one event with exactly the predicted particle, at almost exactly the predicted mass. The symmetry had been right, and that same year the idea behind it, that these particles are built from quarks, was on its way.</w:t>
       </w:r>
     </w:p>
     <w:p>
@@ -3991,7 +3991,7 @@
           <w:sz w:val="22"/>
           <w:szCs w:val="22"/>
         </w:rPr>
-        <w:t xml:space="preserve">In 1956, Tsung-Dao Lee and Chen-Ning Yang noticed that nobody had actually checked it for the weak force. Chien-Shiung Wu did. Working with a team at the National Bureau of Standards, she cooled radioactive cobalt-60 to a hundredth of a degree above absolute zero inside a magnetic field, so the spinning nuclei lined up. If nature respected mirror symmetry, the decay electrons should come out equally in both directions along the spin. They did not. They came out preferentially in one direction. The weak force can tell left from right.</w:t>
+        <w:t xml:space="preserve">In 1956, Tsung-Dao Lee and Chen-Ning Yang noticed that nobody had actually checked it for the weak force. Chien-Shiung Wu did. Working with a team at the National Bureau of Standards, she cooled radioactive cobalt-60 to a few thousandths of a degree above absolute zero inside a magnetic field, so the spinning nuclei lined up. If nature respected mirror symmetry, the decay electrons should come out equally in both directions along the spin. They did not. They came out preferentially in one direction. The weak force can tell left from right.</w:t>
       </w:r>
     </w:p>
     <w:p>
@@ -7660,7 +7660,7 @@
           <w:sz w:val="22"/>
           <w:szCs w:val="22"/>
         </w:rPr>
-        <w:t xml:space="preserve">These are virtual particles. They are not detected directly, the way an ordinary particle is. But their fingerprints are all over the mathematics of quantum field theory, and increasingly, in the laboratory.</w:t>
+        <w:t xml:space="preserve">Virtual particles are not detected directly, the way an ordinary particle is. But their fingerprints are all over the mathematics of quantum field theory, and increasingly, in the laboratory.</w:t>
       </w:r>
     </w:p>
     <w:p>
@@ -9875,7 +9875,7 @@
           <w:sz w:val="22"/>
           <w:szCs w:val="22"/>
         </w:rPr>
-        <w:t xml:space="preserve">First, does it reproduce what we already know, in detail and with numbers? Not "it is compatible with quantum mechanics," but the actual measured value of the electron's magnetic moment to ten decimal places, the actual Lamb shift, the actual way the strength of the strong force changes with energy. The Standard Model passes thousands of such tests. A replacement must pass them too.</w:t>
+        <w:t xml:space="preserve">First, does it reproduce what we already know, in detail and with numbers? Not "it is compatible with quantum mechanics," but the actual measured value of the electron's magnetic moment to about twelve decimal places, the actual Lamb shift, the actual way the strength of the strong force changes with energy. The Standard Model passes thousands of such tests. A replacement must pass them too.</w:t>
       </w:r>
     </w:p>
     <w:p>
@@ -12800,7 +12800,7 @@
           <w:sz w:val="22"/>
           <w:szCs w:val="22"/>
         </w:rPr>
-        <w:t xml:space="preserve">An electrical circuit made of a coil and a capacitor oscillates too, with charge sloshing back and forth between them. Its equation is identical, symbol for symbol, with the coil's inductance playing the role of the mass and the inverse of the capacitance playing the role of the stiffness. The frequency is one divided by the square root of the inductance times the capacitance.</w:t>
+        <w:t xml:space="preserve">An electrical circuit made of a coil and a capacitor oscillates too, with charge sloshing back and forth between them. Its equation is identical, symbol for symbol, with the coil's inductance playing the role of the mass and the inverse of the capacitance playing the role of the stiffness. The angular frequency is one divided by the square root of the inductance times the capacitance.</w:t>
       </w:r>
     </w:p>
     <w:p>
@@ -15508,7 +15508,7 @@
           <w:sz w:val="22"/>
           <w:szCs w:val="22"/>
         </w:rPr>
-        <w:t xml:space="preserve">Leon M. Lederman and Christopher T. Hill, Symmetry and the Beautiful Universe (Prometheus Books, 2004). ISBN 978-1-59102-242-4. Noether's theorem and its consequences, explained for general readers.</w:t>
+        <w:t xml:space="preserve">Leon M. Lederman and Christopher T. Hill, Symmetry and the Beautiful Universe (Prometheus Books, 2004). ISBN 978-1-59102-242-8. Noether's theorem and its consequences, explained for general readers.</w:t>
       </w:r>
     </w:p>
     <w:p>
@@ -15604,7 +15604,7 @@
           <w:sz w:val="22"/>
           <w:szCs w:val="22"/>
         </w:rPr>
-        <w:t xml:space="preserve">Brian Greene, The Elegant Universe (W. W. Norton, 1999). ISBN 978-0-393-04688-2. The most widely read account of string theory, written by one of its practitioners.</w:t>
+        <w:t xml:space="preserve">Brian Greene, The Elegant Universe (W. W. Norton, 1999). ISBN 978-0-393-04688-5. The most widely read account of string theory, written by one of its practitioners.</w:t>
       </w:r>
     </w:p>
     <w:p>
@@ -15839,7 +15839,7 @@
           <w:sz w:val="22"/>
           <w:szCs w:val="22"/>
         </w:rPr>
-        <w:t xml:space="preserve">Greene, Brian. The Elegant Universe. New York: W. W. Norton, 1999. ISBN 978-0-393-04688-2.</w:t>
+        <w:t xml:space="preserve">Greene, Brian. The Elegant Universe. New York: W. W. Norton, 1999. ISBN 978-0-393-04688-5.</w:t>
       </w:r>
     </w:p>
     <w:p>
@@ -15947,7 +15947,7 @@
           <w:sz w:val="22"/>
           <w:szCs w:val="22"/>
         </w:rPr>
-        <w:t xml:space="preserve">Lederman, Leon M., and Christopher T. Hill. Symmetry and the Beautiful Universe. Amherst: Prometheus Books, 2004. ISBN 978-1-59102-242-4.</w:t>
+        <w:t xml:space="preserve">Lederman, Leon M., and Christopher T. Hill. Symmetry and the Beautiful Universe. Amherst: Prometheus Books, 2004. ISBN 978-1-59102-242-8.</w:t>
       </w:r>
     </w:p>
     <w:p>

</xml_diff>